<commit_message>
Paper R: 400-draw Monte Carlo uncertainty and gradient-boosting emulator (kd53)
Co-Authored-By: Claude Opus 5.5 <noreply@anthropic.com>
</commit_message>
<xml_diff>
--- a/paper/kampala_roads_attribution_paperR.docx
+++ b/paper/kampala_roads_attribution_paperR.docx
@@ -344,7 +344,7 @@
         <w:t xml:space="preserve"> </w:t>
       </w:r>
       <w:r>
-        <w:t xml:space="preserve">Siltation remains the largest driver whether channels lose 10% (71–75% of the change) or 50% (87–89%) of their depth.</w:t>
+        <w:t xml:space="preserve">Across 400 Monte Carlo versions of the model, varying 12 uncertain assumptions, siltation is the largest driver in 399. Its share is 77% (90% interval 62–88%) of the increase in impassable road and 79% (64–90%) of the increase in people cut off. A machine-learning emulator (gradient boosting, cross-validated R² = 0.90) shows that the share depends mainly on how much depth silt removes and on channel roughness, while the absolute road length depends most on road height above the terrain model.</w:t>
       </w:r>
       <w:r>
         <w:t xml:space="preserve"> </w:t>
@@ -560,7 +560,7 @@
       </w:r>
     </w:p>
     <w:bookmarkEnd w:id="10"/>
-    <w:bookmarkStart w:id="18" w:name="data-and-methods"/>
+    <w:bookmarkStart w:id="19" w:name="data-and-methods"/>
     <w:p>
       <w:pPr>
         <w:pStyle w:val="Heading1"/>
@@ -1439,13 +1439,13 @@
       </w:r>
     </w:p>
     <w:bookmarkEnd w:id="16"/>
-    <w:bookmarkStart w:id="17" w:name="validation"/>
+    <w:bookmarkStart w:id="17" w:name="X2befbbd2675a937e6d0f8fd382d78f58e6fbc8d"/>
     <w:p>
       <w:pPr>
         <w:pStyle w:val="Heading2"/>
       </w:pPr>
       <w:r>
-        <w:t xml:space="preserve">2.7 Validation</w:t>
+        <w:t xml:space="preserve">2.7 Uncertainty and the machine-learning emulator</w:t>
       </w:r>
     </w:p>
     <w:p>
@@ -1453,12 +1453,345 @@
         <w:pStyle w:val="FirstParagraph"/>
       </w:pPr>
       <w:r>
+        <w:rPr>
+          <w:b/>
+          <w:bCs/>
+        </w:rPr>
+        <w:t xml:space="preserve">Monte Carlo.</w:t>
+      </w:r>
+      <w:r>
+        <w:t xml:space="preserve"> </w:t>
+      </w:r>
+      <w:r>
+        <w:t xml:space="preserve">Twelve assumptions were varied together in 400 Latin hypercube draws (McKay et al. 1979), each re-running all 16 scenarios, six storms and the network model:</w:t>
+      </w:r>
+    </w:p>
+    <w:tbl>
+      <w:tblPr>
+        <w:tblStyle w:val="Table"/>
+        <w:tblW w:type="pct" w:w="5000"/>
+        <w:tblLayout w:type="fixed"/>
+        <w:tblLook w:firstRow="1" w:lastRow="0" w:firstColumn="0" w:lastColumn="0" w:noHBand="0" w:noVBand="0" w:val="0020"/>
+      </w:tblPr>
+      <w:tblGrid>
+        <w:gridCol w:w="3960"/>
+        <w:gridCol w:w="3960"/>
+      </w:tblGrid>
+      <w:tr>
+        <w:trPr>
+          <w:tblHeader w:val="on"/>
+        </w:trPr>
+        <w:tc>
+          <w:tcPr/>
+          <w:p>
+            <w:pPr>
+              <w:pStyle w:val="Compact"/>
+            </w:pPr>
+            <w:r>
+              <w:t xml:space="preserve">Assumption</w:t>
+            </w:r>
+          </w:p>
+        </w:tc>
+        <w:tc>
+          <w:tcPr/>
+          <w:p>
+            <w:pPr>
+              <w:pStyle w:val="Compact"/>
+            </w:pPr>
+            <w:r>
+              <w:t xml:space="preserve">Range (main run)</w:t>
+            </w:r>
+          </w:p>
+        </w:tc>
+      </w:tr>
+      <w:tr>
+        <w:tc>
+          <w:tcPr/>
+          <w:p>
+            <w:pPr>
+              <w:pStyle w:val="Compact"/>
+            </w:pPr>
+            <w:r>
+              <w:t xml:space="preserve">Design standard of the channels</w:t>
+            </w:r>
+          </w:p>
+        </w:tc>
+        <w:tc>
+          <w:tcPr/>
+          <w:p>
+            <w:pPr>
+              <w:pStyle w:val="Compact"/>
+            </w:pPr>
+            <w:r>
+              <w:t xml:space="preserve">5–25-year 1990 flow (10)</w:t>
+            </w:r>
+          </w:p>
+        </w:tc>
+      </w:tr>
+      <w:tr>
+        <w:tc>
+          <w:tcPr/>
+          <w:p>
+            <w:pPr>
+              <w:pStyle w:val="Compact"/>
+            </w:pPr>
+            <w:r>
+              <w:t xml:space="preserve">Manning n: clean channel / silted channel / floodplain</w:t>
+            </w:r>
+          </w:p>
+        </w:tc>
+        <w:tc>
+          <w:tcPr/>
+          <w:p>
+            <w:pPr>
+              <w:pStyle w:val="Compact"/>
+            </w:pPr>
+            <w:r>
+              <w:t xml:space="preserve">0.020–0.030 (0.025) / 0.030–0.045 (0.035) / 0.04–0.10 (0.06)</w:t>
+            </w:r>
+          </w:p>
+        </w:tc>
+      </w:tr>
+      <w:tr>
+        <w:tc>
+          <w:tcPr/>
+          <w:p>
+            <w:pPr>
+              <w:pStyle w:val="Compact"/>
+            </w:pPr>
+            <w:r>
+              <w:t xml:space="preserve">Channel depth lost to silt</w:t>
+            </w:r>
+          </w:p>
+        </w:tc>
+        <w:tc>
+          <w:tcPr/>
+          <w:p>
+            <w:pPr>
+              <w:pStyle w:val="Compact"/>
+            </w:pPr>
+            <w:r>
+              <w:t xml:space="preserve">10–50% (30%)</w:t>
+            </w:r>
+          </w:p>
+        </w:tc>
+      </w:tr>
+      <w:tr>
+        <w:tc>
+          <w:tcPr/>
+          <w:p>
+            <w:pPr>
+              <w:pStyle w:val="Compact"/>
+            </w:pPr>
+            <w:r>
+              <w:t xml:space="preserve">Paving calibration (GHSL → impervious)</w:t>
+            </w:r>
+          </w:p>
+        </w:tc>
+        <w:tc>
+          <w:tcPr/>
+          <w:p>
+            <w:pPr>
+              <w:pStyle w:val="Compact"/>
+            </w:pPr>
+            <w:r>
+              <w:t xml:space="preserve">1.8–2.7 (2.27)</w:t>
+            </w:r>
+          </w:p>
+        </w:tc>
+      </w:tr>
+      <w:tr>
+        <w:tc>
+          <w:tcPr/>
+          <w:p>
+            <w:pPr>
+              <w:pStyle w:val="Compact"/>
+            </w:pPr>
+            <w:r>
+              <w:t xml:space="preserve">Runoff coefficient of unpaved ground</w:t>
+            </w:r>
+          </w:p>
+        </w:tc>
+        <w:tc>
+          <w:tcPr/>
+          <w:p>
+            <w:pPr>
+              <w:pStyle w:val="Compact"/>
+            </w:pPr>
+            <w:r>
+              <w:t xml:space="preserve">0.15–0.35 (0.25)</w:t>
+            </w:r>
+          </w:p>
+        </w:tc>
+      </w:tr>
+      <w:tr>
+        <w:tc>
+          <w:tcPr/>
+          <w:p>
+            <w:pPr>
+              <w:pStyle w:val="Compact"/>
+            </w:pPr>
+            <w:r>
+              <w:t xml:space="preserve">Design-storm error</w:t>
+            </w:r>
+          </w:p>
+        </w:tc>
+        <w:tc>
+          <w:tcPr/>
+          <w:p>
+            <w:pPr>
+              <w:pStyle w:val="Compact"/>
+            </w:pPr>
+            <w:r>
+              <w:t xml:space="preserve">±15%</w:t>
+            </w:r>
+          </w:p>
+        </w:tc>
+      </w:tr>
+      <w:tr>
+        <w:tc>
+          <w:tcPr/>
+          <w:p>
+            <w:pPr>
+              <w:pStyle w:val="Compact"/>
+            </w:pPr>
+            <w:r>
+              <w:t xml:space="preserve">Size of the climate change factor</w:t>
+            </w:r>
+          </w:p>
+        </w:tc>
+        <w:tc>
+          <w:tcPr/>
+          <w:p>
+            <w:pPr>
+              <w:pStyle w:val="Compact"/>
+            </w:pPr>
+            <w:r>
+              <w:t xml:space="preserve">0.5–1.5 × (1)</w:t>
+            </w:r>
+          </w:p>
+        </w:tc>
+      </w:tr>
+      <w:tr>
+        <w:tc>
+          <w:tcPr/>
+          <w:p>
+            <w:pPr>
+              <w:pStyle w:val="Compact"/>
+            </w:pPr>
+            <w:r>
+              <w:t xml:space="preserve">Road surface above the 30 m DEM ground</w:t>
+            </w:r>
+          </w:p>
+        </w:tc>
+        <w:tc>
+          <w:tcPr/>
+          <w:p>
+            <w:pPr>
+              <w:pStyle w:val="Compact"/>
+            </w:pPr>
+            <w:r>
+              <w:t xml:space="preserve">0–0.3 m (0)</w:t>
+            </w:r>
+          </w:p>
+        </w:tc>
+      </w:tr>
+      <w:tr>
+        <w:tc>
+          <w:tcPr/>
+          <w:p>
+            <w:pPr>
+              <w:pStyle w:val="Compact"/>
+            </w:pPr>
+            <w:r>
+              <w:t xml:space="preserve">Floodplain blocked per unit of footprint (walls, fill)</w:t>
+            </w:r>
+          </w:p>
+        </w:tc>
+        <w:tc>
+          <w:tcPr/>
+          <w:p>
+            <w:pPr>
+              <w:pStyle w:val="Compact"/>
+            </w:pPr>
+            <w:r>
+              <w:t xml:space="preserve">1–3 × (1)</w:t>
+            </w:r>
+          </w:p>
+        </w:tc>
+      </w:tr>
+      <w:tr>
+        <w:tc>
+          <w:tcPr/>
+          <w:p>
+            <w:pPr>
+              <w:pStyle w:val="Compact"/>
+            </w:pPr>
+            <w:r>
+              <w:t xml:space="preserve">Depth that stops cars</w:t>
+            </w:r>
+          </w:p>
+        </w:tc>
+        <w:tc>
+          <w:tcPr/>
+          <w:p>
+            <w:pPr>
+              <w:pStyle w:val="Compact"/>
+            </w:pPr>
+            <w:r>
+              <w:t xml:space="preserve">0.2–0.4 m (0.3)</w:t>
+            </w:r>
+          </w:p>
+        </w:tc>
+      </w:tr>
+    </w:tbl>
+    <w:p>
+      <w:pPr>
+        <w:pStyle w:val="BodyText"/>
+      </w:pPr>
+      <w:r>
+        <w:t xml:space="preserve">The rating curves are vectorised over all stretches and the network uses a compiled shortest-path routine (scipy), so one draw takes about 6 s. The central draw reproduces the main results (siltation share 82.5% vs 82.6%).</w:t>
+      </w:r>
+    </w:p>
+    <w:p>
+      <w:pPr>
+        <w:pStyle w:val="BodyText"/>
+      </w:pPr>
+      <w:r>
+        <w:rPr>
+          <w:b/>
+          <w:bCs/>
+        </w:rPr>
+        <w:t xml:space="preserve">Emulator.</w:t>
+      </w:r>
+      <w:r>
+        <w:t xml:space="preserve"> </w:t>
+      </w:r>
+      <w:r>
+        <w:t xml:space="preserve">A gradient-boosting regression (Friedman 2001; scikit-learn, Pedregosa et al. 2011) was trained on the 400 draws to predict the siltation share and the total disruption from the 12 assumptions. It was evaluated by 5-fold cross-validation, and permutation importance (Breiman 2001) ranks the assumptions by their influence. The emulator is used only to explain the uncertainty. The attribution itself comes from the physically based scenarios.</w:t>
+      </w:r>
+    </w:p>
+    <w:bookmarkEnd w:id="17"/>
+    <w:bookmarkStart w:id="18" w:name="validation"/>
+    <w:p>
+      <w:pPr>
+        <w:pStyle w:val="Heading2"/>
+      </w:pPr>
+      <w:r>
+        <w:t xml:space="preserve">2.8 Validation</w:t>
+      </w:r>
+    </w:p>
+    <w:p>
+      <w:pPr>
+        <w:pStyle w:val="FirstParagraph"/>
+      </w:pPr>
+      <w:r>
         <w:t xml:space="preserve">Eight road floods named in the flood catalogue (Paper D0, 2007–2026) were checked against the model. For each, we took the deepest modelled water on the named road within 1.5 km of the reported place.</w:t>
       </w:r>
     </w:p>
-    <w:bookmarkEnd w:id="17"/>
     <w:bookmarkEnd w:id="18"/>
-    <w:bookmarkStart w:id="25" w:name="results"/>
+    <w:bookmarkEnd w:id="19"/>
+    <w:bookmarkStart w:id="27" w:name="results"/>
     <w:p>
       <w:pPr>
         <w:pStyle w:val="Heading1"/>
@@ -1467,7 +1800,7 @@
         <w:t xml:space="preserve">3. Results</w:t>
       </w:r>
     </w:p>
-    <w:bookmarkStart w:id="19" w:name="where-roads-flood"/>
+    <w:bookmarkStart w:id="20" w:name="where-roads-flood"/>
     <w:p>
       <w:pPr>
         <w:pStyle w:val="Heading2"/>
@@ -1844,8 +2177,8 @@
         <w:t xml:space="preserve">Flooding concentrates on the Lubigi system (Bwaise, Kalerwe, the Northern Bypass), on the Nalukolongo (Kibuye–Natete), on the Nakivubo below the city centre, on the Kinawataka along Jinja Road, and on the southern streams crossed by Entebbe Road (Figs. kd46, kd48). In a 10-year storm with silted channels, the trip to the centre is on average 14 minutes longer, averaged over all residents. The figures for hospital access are almost identical.</w:t>
       </w:r>
     </w:p>
-    <w:bookmarkEnd w:id="19"/>
-    <w:bookmarkStart w:id="20" w:name="validation-1"/>
+    <w:bookmarkEnd w:id="20"/>
+    <w:bookmarkStart w:id="21" w:name="validation-1"/>
     <w:p>
       <w:pPr>
         <w:pStyle w:val="Heading2"/>
@@ -2193,8 +2526,8 @@
         <w:t xml:space="preserve">All eight reported roads are impassable in the silted state even in a 2-year storm, and six of eight in a 10-year storm with clean channels. This is consistent with the flood catalogue’s finding that Kampala floods on ordinary rain.</w:t>
       </w:r>
     </w:p>
-    <w:bookmarkEnd w:id="20"/>
-    <w:bookmarkStart w:id="21" w:name="attribution-1"/>
+    <w:bookmarkEnd w:id="21"/>
+    <w:bookmarkStart w:id="22" w:name="attribution-1"/>
     <w:p>
       <w:pPr>
         <w:pStyle w:val="Heading2"/>
@@ -2670,8 +3003,8 @@
         <w:t xml:space="preserve">With clean channels, climate change nearly doubles expected road disruption (30 → 57 km a year; 19,800 → 38,900 people cut off). With silted channels it adds only about 10%, because the system already fails in frequent storms. In other words, maintaining the drains is also what makes climate adaptation visible.</w:t>
       </w:r>
     </w:p>
-    <w:bookmarkEnd w:id="21"/>
-    <w:bookmarkStart w:id="22" w:name="how-much-silt-does-it-take"/>
+    <w:bookmarkEnd w:id="22"/>
+    <w:bookmarkStart w:id="23" w:name="how-much-silt-does-it-take"/>
     <w:p>
       <w:pPr>
         <w:pStyle w:val="Heading2"/>
@@ -2879,14 +3212,537 @@
         <w:t xml:space="preserve">(Fig. kd52.) Even a light silting, a tenth of the channel depth plus a vegetated bed, accounts for most of the change. The conclusion does not depend on the assumed silt level.</w:t>
       </w:r>
     </w:p>
-    <w:bookmarkEnd w:id="22"/>
-    <w:bookmarkStart w:id="23" w:name="the-crossings-to-clear-first"/>
+    <w:bookmarkEnd w:id="23"/>
+    <w:bookmarkStart w:id="24" w:name="uncertainty-400-versions-of-the-model"/>
     <w:p>
       <w:pPr>
         <w:pStyle w:val="Heading2"/>
       </w:pPr>
       <w:r>
-        <w:t xml:space="preserve">3.5 The crossings to clear first</w:t>
+        <w:t xml:space="preserve">3.5 Uncertainty: 400 versions of the model</w:t>
+      </w:r>
+    </w:p>
+    <w:tbl>
+      <w:tblPr>
+        <w:tblStyle w:val="Table"/>
+        <w:tblW w:type="pct" w:w="5000"/>
+        <w:tblLayout w:type="fixed"/>
+        <w:tblLook w:firstRow="1" w:lastRow="0" w:firstColumn="0" w:lastColumn="0" w:noHBand="0" w:noVBand="0" w:val="0020"/>
+      </w:tblPr>
+      <w:tblGrid>
+        <w:gridCol w:w="1980"/>
+        <w:gridCol w:w="1980"/>
+        <w:gridCol w:w="1980"/>
+        <w:gridCol w:w="1980"/>
+      </w:tblGrid>
+      <w:tr>
+        <w:trPr>
+          <w:tblHeader w:val="on"/>
+        </w:trPr>
+        <w:tc>
+          <w:tcPr/>
+          <w:p>
+            <w:pPr>
+              <w:pStyle w:val="Compact"/>
+            </w:pPr>
+            <w:r>
+              <w:t xml:space="preserve">Quantity (today, average year)</w:t>
+            </w:r>
+          </w:p>
+        </w:tc>
+        <w:tc>
+          <w:tcPr/>
+          <w:p>
+            <w:pPr>
+              <w:pStyle w:val="Compact"/>
+            </w:pPr>
+            <w:r>
+              <w:t xml:space="preserve">Main run</w:t>
+            </w:r>
+          </w:p>
+        </w:tc>
+        <w:tc>
+          <w:tcPr/>
+          <w:p>
+            <w:pPr>
+              <w:pStyle w:val="Compact"/>
+            </w:pPr>
+            <w:r>
+              <w:t xml:space="preserve">Median</w:t>
+            </w:r>
+          </w:p>
+        </w:tc>
+        <w:tc>
+          <w:tcPr/>
+          <w:p>
+            <w:pPr>
+              <w:pStyle w:val="Compact"/>
+            </w:pPr>
+            <w:r>
+              <w:t xml:space="preserve">90% interval</w:t>
+            </w:r>
+          </w:p>
+        </w:tc>
+      </w:tr>
+      <w:tr>
+        <w:tc>
+          <w:tcPr/>
+          <w:p>
+            <w:pPr>
+              <w:pStyle w:val="Compact"/>
+            </w:pPr>
+            <w:r>
+              <w:t xml:space="preserve">Siltation share, impassable road</w:t>
+            </w:r>
+          </w:p>
+        </w:tc>
+        <w:tc>
+          <w:tcPr/>
+          <w:p>
+            <w:pPr>
+              <w:pStyle w:val="Compact"/>
+            </w:pPr>
+            <w:r>
+              <w:t xml:space="preserve">83%</w:t>
+            </w:r>
+          </w:p>
+        </w:tc>
+        <w:tc>
+          <w:tcPr/>
+          <w:p>
+            <w:pPr>
+              <w:pStyle w:val="Compact"/>
+            </w:pPr>
+            <w:r>
+              <w:t xml:space="preserve">77%</w:t>
+            </w:r>
+          </w:p>
+        </w:tc>
+        <w:tc>
+          <w:tcPr/>
+          <w:p>
+            <w:pPr>
+              <w:pStyle w:val="Compact"/>
+            </w:pPr>
+            <w:r>
+              <w:t xml:space="preserve">62–88%</w:t>
+            </w:r>
+          </w:p>
+        </w:tc>
+      </w:tr>
+      <w:tr>
+        <w:tc>
+          <w:tcPr/>
+          <w:p>
+            <w:pPr>
+              <w:pStyle w:val="Compact"/>
+            </w:pPr>
+            <w:r>
+              <w:t xml:space="preserve">Siltation share, people cut off</w:t>
+            </w:r>
+          </w:p>
+        </w:tc>
+        <w:tc>
+          <w:tcPr/>
+          <w:p>
+            <w:pPr>
+              <w:pStyle w:val="Compact"/>
+            </w:pPr>
+            <w:r>
+              <w:t xml:space="preserve">86%</w:t>
+            </w:r>
+          </w:p>
+        </w:tc>
+        <w:tc>
+          <w:tcPr/>
+          <w:p>
+            <w:pPr>
+              <w:pStyle w:val="Compact"/>
+            </w:pPr>
+            <w:r>
+              <w:t xml:space="preserve">79%</w:t>
+            </w:r>
+          </w:p>
+        </w:tc>
+        <w:tc>
+          <w:tcPr/>
+          <w:p>
+            <w:pPr>
+              <w:pStyle w:val="Compact"/>
+            </w:pPr>
+            <w:r>
+              <w:t xml:space="preserve">64–90%</w:t>
+            </w:r>
+          </w:p>
+        </w:tc>
+      </w:tr>
+      <w:tr>
+        <w:tc>
+          <w:tcPr/>
+          <w:p>
+            <w:pPr>
+              <w:pStyle w:val="Compact"/>
+            </w:pPr>
+            <w:r>
+              <w:t xml:space="preserve">Paving share, impassable road</w:t>
+            </w:r>
+          </w:p>
+        </w:tc>
+        <w:tc>
+          <w:tcPr/>
+          <w:p>
+            <w:pPr>
+              <w:pStyle w:val="Compact"/>
+            </w:pPr>
+            <w:r>
+              <w:t xml:space="preserve">15%</w:t>
+            </w:r>
+          </w:p>
+        </w:tc>
+        <w:tc>
+          <w:tcPr/>
+          <w:p>
+            <w:pPr>
+              <w:pStyle w:val="Compact"/>
+            </w:pPr>
+            <w:r>
+              <w:t xml:space="preserve">15%</w:t>
+            </w:r>
+          </w:p>
+        </w:tc>
+        <w:tc>
+          <w:tcPr/>
+          <w:p>
+            <w:pPr>
+              <w:pStyle w:val="Compact"/>
+            </w:pPr>
+            <w:r>
+              <w:t xml:space="preserve">8–29%</w:t>
+            </w:r>
+          </w:p>
+        </w:tc>
+      </w:tr>
+      <w:tr>
+        <w:tc>
+          <w:tcPr/>
+          <w:p>
+            <w:pPr>
+              <w:pStyle w:val="Compact"/>
+            </w:pPr>
+            <w:r>
+              <w:t xml:space="preserve">Encroachment share, impassable road</w:t>
+            </w:r>
+          </w:p>
+        </w:tc>
+        <w:tc>
+          <w:tcPr/>
+          <w:p>
+            <w:pPr>
+              <w:pStyle w:val="Compact"/>
+            </w:pPr>
+            <w:r>
+              <w:t xml:space="preserve">2%</w:t>
+            </w:r>
+          </w:p>
+        </w:tc>
+        <w:tc>
+          <w:tcPr/>
+          <w:p>
+            <w:pPr>
+              <w:pStyle w:val="Compact"/>
+            </w:pPr>
+            <w:r>
+              <w:t xml:space="preserve">7%</w:t>
+            </w:r>
+          </w:p>
+        </w:tc>
+        <w:tc>
+          <w:tcPr/>
+          <w:p>
+            <w:pPr>
+              <w:pStyle w:val="Compact"/>
+            </w:pPr>
+            <w:r>
+              <w:t xml:space="preserve">3–14%</w:t>
+            </w:r>
+          </w:p>
+        </w:tc>
+      </w:tr>
+      <w:tr>
+        <w:tc>
+          <w:tcPr/>
+          <w:p>
+            <w:pPr>
+              <w:pStyle w:val="Compact"/>
+            </w:pPr>
+            <w:r>
+              <w:t xml:space="preserve">Climate share by the 2050s, impassable road</w:t>
+            </w:r>
+          </w:p>
+        </w:tc>
+        <w:tc>
+          <w:tcPr/>
+          <w:p>
+            <w:pPr>
+              <w:pStyle w:val="Compact"/>
+            </w:pPr>
+            <w:r>
+              <w:t xml:space="preserve">9%</w:t>
+            </w:r>
+          </w:p>
+        </w:tc>
+        <w:tc>
+          <w:tcPr/>
+          <w:p>
+            <w:pPr>
+              <w:pStyle w:val="Compact"/>
+            </w:pPr>
+            <w:r>
+              <w:t xml:space="preserve">9%</w:t>
+            </w:r>
+          </w:p>
+        </w:tc>
+        <w:tc>
+          <w:tcPr/>
+          <w:p>
+            <w:pPr>
+              <w:pStyle w:val="Compact"/>
+            </w:pPr>
+            <w:r>
+              <w:t xml:space="preserve">5–19%</w:t>
+            </w:r>
+          </w:p>
+        </w:tc>
+      </w:tr>
+      <w:tr>
+        <w:tc>
+          <w:tcPr/>
+          <w:p>
+            <w:pPr>
+              <w:pStyle w:val="Compact"/>
+            </w:pPr>
+            <w:r>
+              <w:t xml:space="preserve">Impassable road, channels silted</w:t>
+            </w:r>
+          </w:p>
+        </w:tc>
+        <w:tc>
+          <w:tcPr/>
+          <w:p>
+            <w:pPr>
+              <w:pStyle w:val="Compact"/>
+            </w:pPr>
+            <w:r>
+              <w:t xml:space="preserve">163 km</w:t>
+            </w:r>
+          </w:p>
+        </w:tc>
+        <w:tc>
+          <w:tcPr/>
+          <w:p>
+            <w:pPr>
+              <w:pStyle w:val="Compact"/>
+            </w:pPr>
+            <w:r>
+              <w:t xml:space="preserve">132 km</w:t>
+            </w:r>
+          </w:p>
+        </w:tc>
+        <w:tc>
+          <w:tcPr/>
+          <w:p>
+            <w:pPr>
+              <w:pStyle w:val="Compact"/>
+            </w:pPr>
+            <w:r>
+              <w:t xml:space="preserve">61–200 km</w:t>
+            </w:r>
+          </w:p>
+        </w:tc>
+      </w:tr>
+      <w:tr>
+        <w:tc>
+          <w:tcPr/>
+          <w:p>
+            <w:pPr>
+              <w:pStyle w:val="Compact"/>
+            </w:pPr>
+            <w:r>
+              <w:t xml:space="preserve">Impassable road, channels clean</w:t>
+            </w:r>
+          </w:p>
+        </w:tc>
+        <w:tc>
+          <w:tcPr/>
+          <w:p>
+            <w:pPr>
+              <w:pStyle w:val="Compact"/>
+            </w:pPr>
+            <w:r>
+              <w:t xml:space="preserve">30 km</w:t>
+            </w:r>
+          </w:p>
+        </w:tc>
+        <w:tc>
+          <w:tcPr/>
+          <w:p>
+            <w:pPr>
+              <w:pStyle w:val="Compact"/>
+            </w:pPr>
+            <w:r>
+              <w:t xml:space="preserve">16 km</w:t>
+            </w:r>
+          </w:p>
+        </w:tc>
+        <w:tc>
+          <w:tcPr/>
+          <w:p>
+            <w:pPr>
+              <w:pStyle w:val="Compact"/>
+            </w:pPr>
+            <w:r>
+              <w:t xml:space="preserve">2–55 km</w:t>
+            </w:r>
+          </w:p>
+        </w:tc>
+      </w:tr>
+      <w:tr>
+        <w:tc>
+          <w:tcPr/>
+          <w:p>
+            <w:pPr>
+              <w:pStyle w:val="Compact"/>
+            </w:pPr>
+            <w:r>
+              <w:t xml:space="preserve">People cut off from centre, silted</w:t>
+            </w:r>
+          </w:p>
+        </w:tc>
+        <w:tc>
+          <w:tcPr/>
+          <w:p>
+            <w:pPr>
+              <w:pStyle w:val="Compact"/>
+            </w:pPr>
+            <w:r>
+              <w:t xml:space="preserve">117,500</w:t>
+            </w:r>
+          </w:p>
+        </w:tc>
+        <w:tc>
+          <w:tcPr/>
+          <w:p>
+            <w:pPr>
+              <w:pStyle w:val="Compact"/>
+            </w:pPr>
+            <w:r>
+              <w:t xml:space="preserve">100,000</w:t>
+            </w:r>
+          </w:p>
+        </w:tc>
+        <w:tc>
+          <w:tcPr/>
+          <w:p>
+            <w:pPr>
+              <w:pStyle w:val="Compact"/>
+            </w:pPr>
+            <w:r>
+              <w:t xml:space="preserve">51,000–139,000</w:t>
+            </w:r>
+          </w:p>
+        </w:tc>
+      </w:tr>
+    </w:tbl>
+    <w:p>
+      <w:pPr>
+        <w:pStyle w:val="BodyText"/>
+      </w:pPr>
+      <w:r>
+        <w:t xml:space="preserve">(Fig. kd53.) Siltation is the largest driver in 399 of 400 draws. The emulator predicts the siltation share well (cross-validated R² = 0.90). Its influence ranking:</w:t>
+      </w:r>
+      <w:r>
+        <w:t xml:space="preserve"> </w:t>
+      </w:r>
+      <w:r>
+        <w:t xml:space="preserve">-</w:t>
+      </w:r>
+      <w:r>
+        <w:t xml:space="preserve"> </w:t>
+      </w:r>
+      <w:r>
+        <w:rPr>
+          <w:b/>
+          <w:bCs/>
+        </w:rPr>
+        <w:t xml:space="preserve">the siltation share</w:t>
+      </w:r>
+      <w:r>
+        <w:t xml:space="preserve"> </w:t>
+      </w:r>
+      <w:r>
+        <w:t xml:space="preserve">depends mainly on silt depth, then the roughness of clean and of silted channels;</w:t>
+      </w:r>
+      <w:r>
+        <w:t xml:space="preserve"> </w:t>
+      </w:r>
+      <w:r>
+        <w:t xml:space="preserve">-</w:t>
+      </w:r>
+      <w:r>
+        <w:t xml:space="preserve"> </w:t>
+      </w:r>
+      <w:r>
+        <w:rPr>
+          <w:b/>
+          <w:bCs/>
+        </w:rPr>
+        <w:t xml:space="preserve">paving’s calibration and the climate signal</w:t>
+      </w:r>
+      <w:r>
+        <w:t xml:space="preserve"> </w:t>
+      </w:r>
+      <w:r>
+        <w:t xml:space="preserve">barely matter for the share;</w:t>
+      </w:r>
+      <w:r>
+        <w:t xml:space="preserve"> </w:t>
+      </w:r>
+      <w:r>
+        <w:t xml:space="preserve">-</w:t>
+      </w:r>
+      <w:r>
+        <w:t xml:space="preserve"> </w:t>
+      </w:r>
+      <w:r>
+        <w:rPr>
+          <w:b/>
+          <w:bCs/>
+        </w:rPr>
+        <w:t xml:space="preserve">the absolute kilometres</w:t>
+      </w:r>
+      <w:r>
+        <w:t xml:space="preserve"> </w:t>
+      </w:r>
+      <w:r>
+        <w:t xml:space="preserve">depend most on how far roads sit above the DEM ground and on floodplain roughness. Absolute road lengths are therefore the least certain result, and the shares the most robust.</w:t>
+      </w:r>
+    </w:p>
+    <w:p>
+      <w:pPr>
+        <w:pStyle w:val="BodyText"/>
+      </w:pPr>
+      <w:r>
+        <w:t xml:space="preserve">Encroachment rises from 2% to a median 7% once buildings are allowed to block more than their footprint. This supports the view that the main run understates it.</w:t>
+      </w:r>
+    </w:p>
+    <w:bookmarkEnd w:id="24"/>
+    <w:bookmarkStart w:id="25" w:name="the-crossings-to-clear-first"/>
+    <w:p>
+      <w:pPr>
+        <w:pStyle w:val="Heading2"/>
+      </w:pPr>
+      <w:r>
+        <w:t xml:space="preserve">3.6 The crossings to clear first</w:t>
       </w:r>
     </w:p>
     <w:p>
@@ -3562,14 +4418,14 @@
         <w:t xml:space="preserve">.</w:t>
       </w:r>
     </w:p>
-    <w:bookmarkEnd w:id="23"/>
-    <w:bookmarkStart w:id="24" w:name="how-the-exposure-was-built"/>
+    <w:bookmarkEnd w:id="25"/>
+    <w:bookmarkStart w:id="26" w:name="how-the-exposure-was-built"/>
     <w:p>
       <w:pPr>
         <w:pStyle w:val="Heading2"/>
       </w:pPr>
       <w:r>
-        <w:t xml:space="preserve">3.6 How the exposure was built</w:t>
+        <w:t xml:space="preserve">3.7 How the exposure was built</w:t>
       </w:r>
     </w:p>
     <w:p>
@@ -3580,9 +4436,9 @@
         <w:t xml:space="preserve">Kampala’s urban road network grew from 2,127 km (1975) to 5,262 km (2020). The share on low ground beside channels stayed near 6%, but its length more than doubled, from 141 to 315 km (Fig. kd47). 526 km of today’s road sits on valley floor that was wetland or bush in 1986. Of the road impassable in a 10-year storm with clean channels, 68% lies on such former wetland. At Lubigi, the Northern Bypass and its feeder roads were built across what was open wetland in 1986 (Fig. kd49).</w:t>
       </w:r>
     </w:p>
-    <w:bookmarkEnd w:id="24"/>
-    <w:bookmarkEnd w:id="25"/>
-    <w:bookmarkStart w:id="26" w:name="discussion"/>
+    <w:bookmarkEnd w:id="26"/>
+    <w:bookmarkEnd w:id="27"/>
+    <w:bookmarkStart w:id="28" w:name="discussion"/>
     <w:p>
       <w:pPr>
         <w:pStyle w:val="Heading1"/>
@@ -3846,8 +4702,30 @@
         <w:t xml:space="preserve">relies on eight reported events: enough to confirm that the model places floods in the right spots, not to calibrate depths.</w:t>
       </w:r>
     </w:p>
-    <w:bookmarkEnd w:id="26"/>
-    <w:bookmarkStart w:id="27" w:name="conclusion"/>
+    <w:p>
+      <w:pPr>
+        <w:pStyle w:val="Compact"/>
+        <w:numPr>
+          <w:ilvl w:val="1"/>
+          <w:numId w:val="1007"/>
+        </w:numPr>
+      </w:pPr>
+      <w:r>
+        <w:rPr>
+          <w:b/>
+          <w:bCs/>
+        </w:rPr>
+        <w:t xml:space="preserve">Culvert dimensions are not observed.</w:t>
+      </w:r>
+      <w:r>
+        <w:t xml:space="preserve"> </w:t>
+      </w:r>
+      <w:r>
+        <w:t xml:space="preserve">Street-level imagery could fill this gap with computer vision: measuring culvert openings and detecting blockage at the ranked crossings. Open archives are thin in Kampala, though. KartaView has a photo within 60 m of only 2 of the top 60 crossings, and Mapillary coverage remains to be checked.</w:t>
+      </w:r>
+    </w:p>
+    <w:bookmarkEnd w:id="28"/>
+    <w:bookmarkStart w:id="29" w:name="conclusion"/>
     <w:p>
       <w:pPr>
         <w:pStyle w:val="Heading1"/>
@@ -3864,8 +4742,8 @@
         <w:t xml:space="preserve">Most of the growth in Kampala’s road flooding since 1990 comes from silted channels, not storms. Siltation explains more than four-fifths of the increase in impassable road and in people cut off. Paving explains most of the rest, and climate change adds less than a tenth by the 2050s. Keeping a short list of channel crossings clear would restore much of the network’s function in ordinary storms. The method uses only open data and can be applied to any city with a road map and a terrain model.</w:t>
       </w:r>
     </w:p>
-    <w:bookmarkEnd w:id="27"/>
-    <w:bookmarkStart w:id="28" w:name="data-and-code-availability"/>
+    <w:bookmarkEnd w:id="29"/>
+    <w:bookmarkStart w:id="30" w:name="data-and-code-availability"/>
     <w:p>
       <w:pPr>
         <w:pStyle w:val="Heading1"/>
@@ -3918,6 +4796,21 @@
         <w:rPr>
           <w:rStyle w:val="VerbatimChar"/>
         </w:rPr>
+        <w:t xml:space="preserve">src/kd_roads_mc.py</w:t>
+      </w:r>
+      <w:r>
+        <w:t xml:space="preserve"> </w:t>
+      </w:r>
+      <w:r>
+        <w:t xml:space="preserve">(Monte Carlo and emulator),</w:t>
+      </w:r>
+      <w:r>
+        <w:t xml:space="preserve"> </w:t>
+      </w:r>
+      <w:r>
+        <w:rPr>
+          <w:rStyle w:val="VerbatimChar"/>
+        </w:rPr>
         <w:t xml:space="preserve">src/kd_roads_maps.py</w:t>
       </w:r>
       <w:r>
@@ -3966,8 +4859,8 @@
         <w:t xml:space="preserve">.</w:t>
       </w:r>
     </w:p>
-    <w:bookmarkEnd w:id="28"/>
-    <w:bookmarkStart w:id="29" w:name="figures"/>
+    <w:bookmarkEnd w:id="30"/>
+    <w:bookmarkStart w:id="31" w:name="figures"/>
     <w:p>
       <w:pPr>
         <w:pStyle w:val="Heading1"/>
@@ -4072,8 +4965,20 @@
         <w:t xml:space="preserve">kd52: sensitivity of the attribution to the silt level.</w:t>
       </w:r>
     </w:p>
-    <w:bookmarkEnd w:id="29"/>
-    <w:bookmarkStart w:id="30" w:name="references"/>
+    <w:p>
+      <w:pPr>
+        <w:pStyle w:val="Compact"/>
+        <w:numPr>
+          <w:ilvl w:val="0"/>
+          <w:numId w:val="1008"/>
+        </w:numPr>
+      </w:pPr>
+      <w:r>
+        <w:t xml:space="preserve">kd53: Monte Carlo uncertainty (400 draws) and the emulator’s ranking of assumptions.</w:t>
+      </w:r>
+    </w:p>
+    <w:bookmarkEnd w:id="31"/>
+    <w:bookmarkStart w:id="32" w:name="references"/>
     <w:p>
       <w:pPr>
         <w:pStyle w:val="Heading1"/>
@@ -4548,10 +5453,122 @@
         </w:numPr>
       </w:pPr>
       <w:r>
+        <w:t xml:space="preserve">Breiman, L. (2001). Random forests.</w:t>
+      </w:r>
+      <w:r>
+        <w:t xml:space="preserve"> </w:t>
+      </w:r>
+      <w:r>
+        <w:rPr>
+          <w:i/>
+          <w:iCs/>
+        </w:rPr>
+        <w:t xml:space="preserve">Machine Learning</w:t>
+      </w:r>
+      <w:r>
+        <w:t xml:space="preserve"> </w:t>
+      </w:r>
+      <w:r>
+        <w:t xml:space="preserve">45, 5–32.</w:t>
+      </w:r>
+    </w:p>
+    <w:p>
+      <w:pPr>
+        <w:pStyle w:val="Compact"/>
+        <w:numPr>
+          <w:ilvl w:val="0"/>
+          <w:numId w:val="1009"/>
+        </w:numPr>
+      </w:pPr>
+      <w:r>
+        <w:t xml:space="preserve">Friedman, J. H. (2001). Greedy function approximation: a gradient boosting machine.</w:t>
+      </w:r>
+      <w:r>
+        <w:t xml:space="preserve"> </w:t>
+      </w:r>
+      <w:r>
+        <w:rPr>
+          <w:i/>
+          <w:iCs/>
+        </w:rPr>
+        <w:t xml:space="preserve">Annals of Statistics</w:t>
+      </w:r>
+      <w:r>
+        <w:t xml:space="preserve"> </w:t>
+      </w:r>
+      <w:r>
+        <w:t xml:space="preserve">29(5), 1189–1232.</w:t>
+      </w:r>
+    </w:p>
+    <w:p>
+      <w:pPr>
+        <w:pStyle w:val="Compact"/>
+        <w:numPr>
+          <w:ilvl w:val="0"/>
+          <w:numId w:val="1009"/>
+        </w:numPr>
+      </w:pPr>
+      <w:r>
+        <w:t xml:space="preserve">McKay, M. D., Beckman, R. J. and Conover, W. J. (1979). A comparison of three methods for selecting values of input variables in the analysis of output from a computer code.</w:t>
+      </w:r>
+      <w:r>
+        <w:t xml:space="preserve"> </w:t>
+      </w:r>
+      <w:r>
+        <w:rPr>
+          <w:i/>
+          <w:iCs/>
+        </w:rPr>
+        <w:t xml:space="preserve">Technometrics</w:t>
+      </w:r>
+      <w:r>
+        <w:t xml:space="preserve"> </w:t>
+      </w:r>
+      <w:r>
+        <w:t xml:space="preserve">21(2), 239–245.</w:t>
+      </w:r>
+    </w:p>
+    <w:p>
+      <w:pPr>
+        <w:pStyle w:val="Compact"/>
+        <w:numPr>
+          <w:ilvl w:val="0"/>
+          <w:numId w:val="1009"/>
+        </w:numPr>
+      </w:pPr>
+      <w:r>
+        <w:t xml:space="preserve">Pedregosa, F. et al. (2011). Scikit-learn: machine learning in Python.</w:t>
+      </w:r>
+      <w:r>
+        <w:t xml:space="preserve"> </w:t>
+      </w:r>
+      <w:r>
+        <w:rPr>
+          <w:i/>
+          <w:iCs/>
+        </w:rPr>
+        <w:t xml:space="preserve">Journal of Machine Learning Research</w:t>
+      </w:r>
+      <w:r>
+        <w:t xml:space="preserve"> </w:t>
+      </w:r>
+      <w:r>
+        <w:t xml:space="preserve">12, 2825–2830.</w:t>
+      </w:r>
+    </w:p>
+    <w:p>
+      <w:pPr>
+        <w:pStyle w:val="Compact"/>
+        <w:numPr>
+          <w:ilvl w:val="0"/>
+          <w:numId w:val="1009"/>
+        </w:numPr>
+      </w:pPr>
+      <w:r>
         <w:t xml:space="preserve">Companion papers of this programme: A, D0 (flood catalogue), 1 (lost sponge, incl. machine-learning land cover), 3 (access), 4 (damage), 6 (channel design drift), 7 (regional cities).</w:t>
       </w:r>
     </w:p>
-    <w:bookmarkEnd w:id="30"/>
+    <w:bookmarkEnd w:id="32"/>
     <w:sectPr>
       <w:footnotePr>
         <w:numRestart w:val="eachSect"/>

</xml_diff>

<commit_message>
Paper R upgrades: independent validation (AUC 0.80 silted), Sentinel-2 channel test, spatial silt, costs; 10 m vegetation check in Papers 1-2 and posts
Co-Authored-By: Claude Opus 5.5 <noreply@anthropic.com>
</commit_message>
<xml_diff>
--- a/paper/kampala_roads_attribution_paperR.docx
+++ b/paper/kampala_roads_attribution_paperR.docx
@@ -351,6 +351,50 @@
       </w:r>
       <w:r>
         <w:t xml:space="preserve">6.</w:t>
+      </w:r>
+      <w:r>
+        <w:t xml:space="preserve"> </w:t>
+      </w:r>
+      <w:r>
+        <w:rPr>
+          <w:b/>
+          <w:bCs/>
+        </w:rPr>
+        <w:t xml:space="preserve">The model puts floods where people report them, and the silted version does so best.</w:t>
+      </w:r>
+      <w:r>
+        <w:t xml:space="preserve"> </w:t>
+      </w:r>
+      <w:r>
+        <w:t xml:space="preserve">Reported flood-prone roads (KCCA’s 2021 risk assessment, press lists and the flood catalogue) lie a median 335 m from modelled impassable main road, against 1,000 m for random road locations (AUC 0.80, p &lt; 0.001). With clean channels the match is weaker (AUC 0.70), which is indirect evidence that the channels really are silted.</w:t>
+      </w:r>
+      <w:r>
+        <w:t xml:space="preserve"> </w:t>
+      </w:r>
+      <w:r>
+        <w:t xml:space="preserve">7.</w:t>
+      </w:r>
+      <w:r>
+        <w:t xml:space="preserve"> </w:t>
+      </w:r>
+      <w:r>
+        <w:rPr>
+          <w:b/>
+          <w:bCs/>
+        </w:rPr>
+        <w:t xml:space="preserve">Keeping channels clean is worth far more than it costs.</w:t>
+      </w:r>
+      <w:r>
+        <w:t xml:space="preserve"> </w:t>
+      </w:r>
+      <w:r>
+        <w:t xml:space="preserve">Avoided travel disruption (about US$0.5 million a year) plus avoided building damage (US$17 million, Paper 4) is about 6.6 times KCCA’s annual road-and-drainage maintenance allocation.</w:t>
+      </w:r>
+      <w:r>
+        <w:t xml:space="preserve"> </w:t>
+      </w:r>
+      <w:r>
+        <w:t xml:space="preserve">8.</w:t>
       </w:r>
       <w:r>
         <w:t xml:space="preserve"> </w:t>
@@ -470,7 +514,7 @@
         </w:numPr>
       </w:pPr>
       <w:r>
-        <w:t xml:space="preserve">A recent traffic study of 22 links found overtopping from the 5-year storm and near-doubling of travel times under full closure (TRID record 2724562).</w:t>
+        <w:t xml:space="preserve">A recent traffic study of 22 links found overtopping from the 5-year storm and near-doubling of travel times under full closure (TRID record 2724562; published on ScienceDirect, article S2950196226000311).</w:t>
       </w:r>
     </w:p>
     <w:p>
@@ -560,7 +604,7 @@
       </w:r>
     </w:p>
     <w:bookmarkEnd w:id="10"/>
-    <w:bookmarkStart w:id="19" w:name="data-and-methods"/>
+    <w:bookmarkStart w:id="21" w:name="data-and-methods"/>
     <w:p>
       <w:pPr>
         <w:pStyle w:val="Heading1"/>
@@ -1786,12 +1830,92 @@
         <w:pStyle w:val="FirstParagraph"/>
       </w:pPr>
       <w:r>
-        <w:t xml:space="preserve">Eight road floods named in the flood catalogue (Paper D0, 2007–2026) were checked against the model. For each, we took the deepest modelled water on the named road within 1.5 km of the reported place.</w:t>
+        <w:t xml:space="preserve">Two tests, against two independent sets of reports:</w:t>
+      </w:r>
+      <w:r>
+        <w:t xml:space="preserve"> </w:t>
+      </w:r>
+      <w:r>
+        <w:t xml:space="preserve">1.</w:t>
+      </w:r>
+      <w:r>
+        <w:t xml:space="preserve"> </w:t>
+      </w:r>
+      <w:r>
+        <w:rPr>
+          <w:b/>
+          <w:bCs/>
+        </w:rPr>
+        <w:t xml:space="preserve">Catalogue road floods.</w:t>
+      </w:r>
+      <w:r>
+        <w:t xml:space="preserve"> </w:t>
+      </w:r>
+      <w:r>
+        <w:t xml:space="preserve">Eight road floods named in the flood catalogue (Paper D0, 2007–2026). For each, the deepest modelled water on the named road within 1.5 km of the reported place.</w:t>
+      </w:r>
+      <w:r>
+        <w:t xml:space="preserve"> </w:t>
+      </w:r>
+      <w:r>
+        <w:t xml:space="preserve">2.</w:t>
+      </w:r>
+      <w:r>
+        <w:t xml:space="preserve"> </w:t>
+      </w:r>
+      <w:r>
+        <w:rPr>
+          <w:b/>
+          <w:bCs/>
+        </w:rPr>
+        <w:t xml:space="preserve">Flood-prone road list.</w:t>
+      </w:r>
+      <w:r>
+        <w:t xml:space="preserve"> </w:t>
+      </w:r>
+      <w:r>
+        <w:t xml:space="preserve">Seventeen flood-prone road locations: those named from KCCA’s 2021 risk assessment (as listed in the Daily Monitor, 2023: Jinja Road at Game–Shoprite and at Banda, Lugogo Bypass, Kyambogo Junction, Kibuli Road, Mulago), the Observer’s list of roads often cut off (Queen’s Way, Ssebaana Kizito Road, Kabuusu, the Jinja Road roundabout), and the catalogue’s road floods. Twelve could be geocoded (OpenStreetMap Nominatim, or the catalogue’s positions). Report locations are approximate (±500 m), so the test asks whether reported spots lie closer to modelled impassable main road (10-year storm) than 5,000 random points on main roads do. We report the proximity AUC and a one-sided Mann–Whitney test (Mann and Whitney 1947).</w:t>
       </w:r>
     </w:p>
     <w:bookmarkEnd w:id="18"/>
+    <w:bookmarkStart w:id="19" w:name="can-satellites-see-channel-condition"/>
+    <w:p>
+      <w:pPr>
+        <w:pStyle w:val="Heading2"/>
+      </w:pPr>
+      <w:r>
+        <w:t xml:space="preserve">2.9 Can satellites see channel condition?</w:t>
+      </w:r>
+    </w:p>
+    <w:p>
+      <w:pPr>
+        <w:pStyle w:val="FirstParagraph"/>
+      </w:pPr>
+      <w:r>
+        <w:t xml:space="preserve">To replace the uniform silt scenario with an observed one, we built Sentinel-2 dry-season median NDVI composites at 10 m for five seasons (2024–2026) and sampled the centreline of every channel stretch draining at least 3 km² (3,604 stretches, 262 km), and a band 30–60 m either side. We also ran a spatially varying silt scenario: depth lost = 10% + 40% × the stretch’s dumping-pressure percentile (OSM waste points and markets; mean ≈ 30%).</w:t>
+      </w:r>
+    </w:p>
     <w:bookmarkEnd w:id="19"/>
-    <w:bookmarkStart w:id="27" w:name="results"/>
+    <w:bookmarkStart w:id="20" w:name="valuing-disruption"/>
+    <w:p>
+      <w:pPr>
+        <w:pStyle w:val="Heading2"/>
+      </w:pPr>
+      <w:r>
+        <w:t xml:space="preserve">2.10 Valuing disruption</w:t>
+      </w:r>
+    </w:p>
+    <w:p>
+      <w:pPr>
+        <w:pStyle w:val="FirstParagraph"/>
+      </w:pPr>
+      <w:r>
+        <w:t xml:space="preserve">Annual value of lost access = people cut off (expected annual) × hours a crossing stays impassable (2–8 h, flash floods) × share of residents travelling during the event (30–70%) × value of travel time (US$0.5–1.8 per hour; no official Ugandan value exists, and the upper end follows a published Kampala productivity estimate). Extra minutes for those still connected are valued the same way. All terms were sampled jointly (20,000 draws). This is compared with avoided building damage (Paper 4) and with KCCA’s road-and-drainage maintenance allocation (UGX 10 billion, about US$2.7 million a year).</w:t>
+      </w:r>
+    </w:p>
+    <w:bookmarkEnd w:id="20"/>
+    <w:bookmarkEnd w:id="21"/>
+    <w:bookmarkStart w:id="31" w:name="results"/>
     <w:p>
       <w:pPr>
         <w:pStyle w:val="Heading1"/>
@@ -1800,7 +1924,7 @@
         <w:t xml:space="preserve">3. Results</w:t>
       </w:r>
     </w:p>
-    <w:bookmarkStart w:id="20" w:name="where-roads-flood"/>
+    <w:bookmarkStart w:id="22" w:name="where-roads-flood"/>
     <w:p>
       <w:pPr>
         <w:pStyle w:val="Heading2"/>
@@ -2177,8 +2301,8 @@
         <w:t xml:space="preserve">Flooding concentrates on the Lubigi system (Bwaise, Kalerwe, the Northern Bypass), on the Nalukolongo (Kibuye–Natete), on the Nakivubo below the city centre, on the Kinawataka along Jinja Road, and on the southern streams crossed by Entebbe Road (Figs. kd46, kd48). In a 10-year storm with silted channels, the trip to the centre is on average 14 minutes longer, averaged over all residents. The figures for hospital access are almost identical.</w:t>
       </w:r>
     </w:p>
-    <w:bookmarkEnd w:id="20"/>
-    <w:bookmarkStart w:id="21" w:name="validation-1"/>
+    <w:bookmarkEnd w:id="22"/>
+    <w:bookmarkStart w:id="23" w:name="validation-1"/>
     <w:p>
       <w:pPr>
         <w:pStyle w:val="Heading2"/>
@@ -2526,14 +2650,472 @@
         <w:t xml:space="preserve">All eight reported roads are impassable in the silted state even in a 2-year storm, and six of eight in a 10-year storm with clean channels. This is consistent with the flood catalogue’s finding that Kampala floods on ordinary rain.</w:t>
       </w:r>
     </w:p>
-    <w:bookmarkEnd w:id="21"/>
-    <w:bookmarkStart w:id="22" w:name="attribution-1"/>
+    <w:p>
+      <w:pPr>
+        <w:pStyle w:val="BodyText"/>
+      </w:pPr>
+      <w:r>
+        <w:rPr>
+          <w:b/>
+          <w:bCs/>
+        </w:rPr>
+        <w:t xml:space="preserve">The independent list</w:t>
+      </w:r>
+      <w:r>
+        <w:t xml:space="preserve"> </w:t>
+      </w:r>
+      <w:r>
+        <w:t xml:space="preserve">(Fig. kd54):</w:t>
+      </w:r>
+    </w:p>
+    <w:tbl>
+      <w:tblPr>
+        <w:tblStyle w:val="Table"/>
+        <w:tblW w:type="pct" w:w="5000"/>
+        <w:tblLayout w:type="fixed"/>
+        <w:tblLook w:firstRow="1" w:lastRow="0" w:firstColumn="0" w:lastColumn="0" w:noHBand="0" w:noVBand="0" w:val="0020"/>
+      </w:tblPr>
+      <w:tblGrid>
+        <w:gridCol w:w="1320"/>
+        <w:gridCol w:w="1320"/>
+        <w:gridCol w:w="1320"/>
+        <w:gridCol w:w="1320"/>
+        <w:gridCol w:w="1320"/>
+        <w:gridCol w:w="1320"/>
+      </w:tblGrid>
+      <w:tr>
+        <w:trPr>
+          <w:tblHeader w:val="on"/>
+        </w:trPr>
+        <w:tc>
+          <w:tcPr/>
+          <w:p>
+            <w:pPr>
+              <w:pStyle w:val="Compact"/>
+            </w:pPr>
+            <w:r>
+              <w:t xml:space="preserve">10-year storm</w:t>
+            </w:r>
+          </w:p>
+        </w:tc>
+        <w:tc>
+          <w:tcPr/>
+          <w:p>
+            <w:pPr>
+              <w:pStyle w:val="Compact"/>
+            </w:pPr>
+            <w:r>
+              <w:t xml:space="preserve">Median distance, reported spots → modelled impassable main road</w:t>
+            </w:r>
+          </w:p>
+        </w:tc>
+        <w:tc>
+          <w:tcPr/>
+          <w:p>
+            <w:pPr>
+              <w:pStyle w:val="Compact"/>
+            </w:pPr>
+            <w:r>
+              <w:t xml:space="preserve">Random road points</w:t>
+            </w:r>
+          </w:p>
+        </w:tc>
+        <w:tc>
+          <w:tcPr/>
+          <w:p>
+            <w:pPr>
+              <w:pStyle w:val="Compact"/>
+            </w:pPr>
+            <w:r>
+              <w:t xml:space="preserve">Reported within 500 m</w:t>
+            </w:r>
+          </w:p>
+        </w:tc>
+        <w:tc>
+          <w:tcPr/>
+          <w:p>
+            <w:pPr>
+              <w:pStyle w:val="Compact"/>
+            </w:pPr>
+            <w:r>
+              <w:t xml:space="preserve">Random within 500 m</w:t>
+            </w:r>
+          </w:p>
+        </w:tc>
+        <w:tc>
+          <w:tcPr/>
+          <w:p>
+            <w:pPr>
+              <w:pStyle w:val="Compact"/>
+            </w:pPr>
+            <w:r>
+              <w:t xml:space="preserve">Proximity AUC</w:t>
+            </w:r>
+          </w:p>
+        </w:tc>
+      </w:tr>
+      <w:tr>
+        <w:tc>
+          <w:tcPr/>
+          <w:p>
+            <w:pPr>
+              <w:pStyle w:val="Compact"/>
+            </w:pPr>
+            <w:r>
+              <w:t xml:space="preserve">Channels clean</w:t>
+            </w:r>
+          </w:p>
+        </w:tc>
+        <w:tc>
+          <w:tcPr/>
+          <w:p>
+            <w:pPr>
+              <w:pStyle w:val="Compact"/>
+            </w:pPr>
+            <w:r>
+              <w:t xml:space="preserve">824 m</w:t>
+            </w:r>
+          </w:p>
+        </w:tc>
+        <w:tc>
+          <w:tcPr/>
+          <w:p>
+            <w:pPr>
+              <w:pStyle w:val="Compact"/>
+            </w:pPr>
+            <w:r>
+              <w:t xml:space="preserve">1,560 m</w:t>
+            </w:r>
+          </w:p>
+        </w:tc>
+        <w:tc>
+          <w:tcPr/>
+          <w:p>
+            <w:pPr>
+              <w:pStyle w:val="Compact"/>
+            </w:pPr>
+            <w:r>
+              <w:t xml:space="preserve">33%</w:t>
+            </w:r>
+          </w:p>
+        </w:tc>
+        <w:tc>
+          <w:tcPr/>
+          <w:p>
+            <w:pPr>
+              <w:pStyle w:val="Compact"/>
+            </w:pPr>
+            <w:r>
+              <w:t xml:space="preserve">15%</w:t>
+            </w:r>
+          </w:p>
+        </w:tc>
+        <w:tc>
+          <w:tcPr/>
+          <w:p>
+            <w:pPr>
+              <w:pStyle w:val="Compact"/>
+            </w:pPr>
+            <w:r>
+              <w:t xml:space="preserve">0.70 (p = 0.009)</w:t>
+            </w:r>
+          </w:p>
+        </w:tc>
+      </w:tr>
+      <w:tr>
+        <w:tc>
+          <w:tcPr/>
+          <w:p>
+            <w:pPr>
+              <w:pStyle w:val="Compact"/>
+            </w:pPr>
+            <w:r>
+              <w:t xml:space="preserve">Channels silted</w:t>
+            </w:r>
+          </w:p>
+        </w:tc>
+        <w:tc>
+          <w:tcPr/>
+          <w:p>
+            <w:pPr>
+              <w:pStyle w:val="Compact"/>
+            </w:pPr>
+            <w:r>
+              <w:t xml:space="preserve">335 m</w:t>
+            </w:r>
+          </w:p>
+        </w:tc>
+        <w:tc>
+          <w:tcPr/>
+          <w:p>
+            <w:pPr>
+              <w:pStyle w:val="Compact"/>
+            </w:pPr>
+            <w:r>
+              <w:t xml:space="preserve">1,000 m</w:t>
+            </w:r>
+          </w:p>
+        </w:tc>
+        <w:tc>
+          <w:tcPr/>
+          <w:p>
+            <w:pPr>
+              <w:pStyle w:val="Compact"/>
+            </w:pPr>
+            <w:r>
+              <w:t xml:space="preserve">83%</w:t>
+            </w:r>
+          </w:p>
+        </w:tc>
+        <w:tc>
+          <w:tcPr/>
+          <w:p>
+            <w:pPr>
+              <w:pStyle w:val="Compact"/>
+            </w:pPr>
+            <w:r>
+              <w:t xml:space="preserve">27%</w:t>
+            </w:r>
+          </w:p>
+        </w:tc>
+        <w:tc>
+          <w:tcPr/>
+          <w:p>
+            <w:pPr>
+              <w:pStyle w:val="Compact"/>
+            </w:pPr>
+            <w:r>
+              <w:t xml:space="preserve">0.80 (p &lt; 0.001)</w:t>
+            </w:r>
+          </w:p>
+        </w:tc>
+      </w:tr>
+    </w:tbl>
+    <w:p>
+      <w:pPr>
+        <w:pStyle w:val="BodyText"/>
+      </w:pPr>
+      <w:r>
+        <w:t xml:space="preserve">Reported flood-prone roads lie much closer to modelled flooding than random road locations. Two points matter:</w:t>
+      </w:r>
+      <w:r>
+        <w:t xml:space="preserve"> </w:t>
+      </w:r>
+      <w:r>
+        <w:t xml:space="preserve">-</w:t>
+      </w:r>
+      <w:r>
+        <w:t xml:space="preserve"> </w:t>
+      </w:r>
+      <w:r>
+        <w:rPr>
+          <w:b/>
+          <w:bCs/>
+        </w:rPr>
+        <w:t xml:space="preserve">The silted model matches the reports better than the clean one.</w:t>
+      </w:r>
+      <w:r>
+        <w:t xml:space="preserve"> </w:t>
+      </w:r>
+      <w:r>
+        <w:t xml:space="preserve">It is not just that silted channels flood more roads: the comparison against random points controls for that. The reported pattern of flooding is better explained by silted channels, which is indirect evidence for the scenario this paper puts at the centre.</w:t>
+      </w:r>
+      <w:r>
+        <w:t xml:space="preserve"> </w:t>
+      </w:r>
+      <w:r>
+        <w:t xml:space="preserve">-</w:t>
+      </w:r>
+      <w:r>
+        <w:t xml:space="preserve"> </w:t>
+      </w:r>
+      <w:r>
+        <w:rPr>
+          <w:b/>
+          <w:bCs/>
+        </w:rPr>
+        <w:t xml:space="preserve">Some reported spots are street floods, not channel floods.</w:t>
+      </w:r>
+      <w:r>
+        <w:t xml:space="preserve"> </w:t>
+      </w:r>
+      <w:r>
+        <w:t xml:space="preserve">At Banda and Kyambogo Junction the model places the water at the Kinawataka crossings 300–700 m away, not at the junction itself. Junction flooding there is partly from blocked roadside drains, which this model does not simulate.</w:t>
+      </w:r>
+    </w:p>
+    <w:bookmarkEnd w:id="23"/>
+    <w:bookmarkStart w:id="24" w:name="Xad036d2ce206fc05a6d3f5d5147141a2797f983"/>
     <w:p>
       <w:pPr>
         <w:pStyle w:val="Heading2"/>
       </w:pPr>
       <w:r>
-        <w:t xml:space="preserve">3.3 Attribution</w:t>
+        <w:t xml:space="preserve">3.3 Satellites cannot see the channels; where the silt sits does not matter</w:t>
+      </w:r>
+    </w:p>
+    <w:p>
+      <w:pPr>
+        <w:pStyle w:val="FirstParagraph"/>
+      </w:pPr>
+      <w:r>
+        <w:t xml:space="preserve">At 10 m, centreline NDVI tracks the surrounding land almost perfectly (r = 0.90): channels in green fringe areas look</w:t>
+      </w:r>
+      <w:r>
+        <w:t xml:space="preserve"> </w:t>
+      </w:r>
+      <w:r>
+        <w:t xml:space="preserve">“choked”</w:t>
+      </w:r>
+      <w:r>
+        <w:t xml:space="preserve">, and channels in dense neighbourhoods look</w:t>
+      </w:r>
+      <w:r>
+        <w:t xml:space="preserve"> </w:t>
+      </w:r>
+      <w:r>
+        <w:t xml:space="preserve">“clean”</w:t>
+      </w:r>
+      <w:r>
+        <w:t xml:space="preserve">. The difference between channel and surroundings is tiny (median +0.007) and is unrelated to dumping pressure (Spearman −0.10) or to reported hotspots. Kampala’s channels, mostly under 10 m wide, cannot be inspected from Sentinel-2. Their condition needs very-high-resolution imagery, drones or KCCA’s desilting records. We therefore keep silt as a scenario and test its pattern instead:</w:t>
+      </w:r>
+    </w:p>
+    <w:tbl>
+      <w:tblPr>
+        <w:tblStyle w:val="Table"/>
+        <w:tblW w:type="pct" w:w="5000"/>
+        <w:tblLayout w:type="fixed"/>
+        <w:tblLook w:firstRow="1" w:lastRow="0" w:firstColumn="0" w:lastColumn="0" w:noHBand="0" w:noVBand="0" w:val="0020"/>
+      </w:tblPr>
+      <w:tblGrid>
+        <w:gridCol w:w="2640"/>
+        <w:gridCol w:w="2640"/>
+        <w:gridCol w:w="2640"/>
+      </w:tblGrid>
+      <w:tr>
+        <w:trPr>
+          <w:tblHeader w:val="on"/>
+        </w:trPr>
+        <w:tc>
+          <w:tcPr/>
+          <w:p>
+            <w:pPr>
+              <w:pStyle w:val="Compact"/>
+            </w:pPr>
+            <w:r>
+              <w:t xml:space="preserve">Silt pattern (mean ≈ 30% of depth)</w:t>
+            </w:r>
+          </w:p>
+        </w:tc>
+        <w:tc>
+          <w:tcPr/>
+          <w:p>
+            <w:pPr>
+              <w:pStyle w:val="Compact"/>
+            </w:pPr>
+            <w:r>
+              <w:t xml:space="preserve">Siltation share, impassable road / people cut off</w:t>
+            </w:r>
+          </w:p>
+        </w:tc>
+        <w:tc>
+          <w:tcPr/>
+          <w:p>
+            <w:pPr>
+              <w:pStyle w:val="Compact"/>
+            </w:pPr>
+            <w:r>
+              <w:t xml:space="preserve">Impassable road, 2-year storm</w:t>
+            </w:r>
+          </w:p>
+        </w:tc>
+      </w:tr>
+      <w:tr>
+        <w:tc>
+          <w:tcPr/>
+          <w:p>
+            <w:pPr>
+              <w:pStyle w:val="Compact"/>
+            </w:pPr>
+            <w:r>
+              <w:t xml:space="preserve">Uniform</w:t>
+            </w:r>
+          </w:p>
+        </w:tc>
+        <w:tc>
+          <w:tcPr/>
+          <w:p>
+            <w:pPr>
+              <w:pStyle w:val="Compact"/>
+            </w:pPr>
+            <w:r>
+              <w:t xml:space="preserve">83% / 86%</w:t>
+            </w:r>
+          </w:p>
+        </w:tc>
+        <w:tc>
+          <w:tcPr/>
+          <w:p>
+            <w:pPr>
+              <w:pStyle w:val="Compact"/>
+            </w:pPr>
+            <w:r>
+              <w:t xml:space="preserve">199 km</w:t>
+            </w:r>
+          </w:p>
+        </w:tc>
+      </w:tr>
+      <w:tr>
+        <w:tc>
+          <w:tcPr/>
+          <w:p>
+            <w:pPr>
+              <w:pStyle w:val="Compact"/>
+            </w:pPr>
+            <w:r>
+              <w:t xml:space="preserve">Concentrated where dumping is heaviest</w:t>
+            </w:r>
+          </w:p>
+        </w:tc>
+        <w:tc>
+          <w:tcPr/>
+          <w:p>
+            <w:pPr>
+              <w:pStyle w:val="Compact"/>
+            </w:pPr>
+            <w:r>
+              <w:t xml:space="preserve">84% / 87%</w:t>
+            </w:r>
+          </w:p>
+        </w:tc>
+        <w:tc>
+          <w:tcPr/>
+          <w:p>
+            <w:pPr>
+              <w:pStyle w:val="Compact"/>
+            </w:pPr>
+            <w:r>
+              <w:t xml:space="preserve">208 km</w:t>
+            </w:r>
+          </w:p>
+        </w:tc>
+      </w:tr>
+    </w:tbl>
+    <w:p>
+      <w:pPr>
+        <w:pStyle w:val="BodyText"/>
+      </w:pPr>
+      <w:r>
+        <w:t xml:space="preserve">Where the silt sits changes the answer very little.</w:t>
+      </w:r>
+    </w:p>
+    <w:bookmarkEnd w:id="24"/>
+    <w:bookmarkStart w:id="25" w:name="attribution-1"/>
+    <w:p>
+      <w:pPr>
+        <w:pStyle w:val="Heading2"/>
+      </w:pPr>
+      <w:r>
+        <w:t xml:space="preserve">3.4 Attribution</w:t>
       </w:r>
     </w:p>
     <w:tbl>
@@ -3003,14 +3585,14 @@
         <w:t xml:space="preserve">With clean channels, climate change nearly doubles expected road disruption (30 → 57 km a year; 19,800 → 38,900 people cut off). With silted channels it adds only about 10%, because the system already fails in frequent storms. In other words, maintaining the drains is also what makes climate adaptation visible.</w:t>
       </w:r>
     </w:p>
-    <w:bookmarkEnd w:id="22"/>
-    <w:bookmarkStart w:id="23" w:name="how-much-silt-does-it-take"/>
+    <w:bookmarkEnd w:id="25"/>
+    <w:bookmarkStart w:id="26" w:name="how-much-silt-does-it-take"/>
     <w:p>
       <w:pPr>
         <w:pStyle w:val="Heading2"/>
       </w:pPr>
       <w:r>
-        <w:t xml:space="preserve">3.4 How much silt does it take?</w:t>
+        <w:t xml:space="preserve">3.5 How much silt does it take?</w:t>
       </w:r>
     </w:p>
     <w:tbl>
@@ -3212,14 +3794,14 @@
         <w:t xml:space="preserve">(Fig. kd52.) Even a light silting, a tenth of the channel depth plus a vegetated bed, accounts for most of the change. The conclusion does not depend on the assumed silt level.</w:t>
       </w:r>
     </w:p>
-    <w:bookmarkEnd w:id="23"/>
-    <w:bookmarkStart w:id="24" w:name="uncertainty-400-versions-of-the-model"/>
+    <w:bookmarkEnd w:id="26"/>
+    <w:bookmarkStart w:id="27" w:name="uncertainty-400-versions-of-the-model"/>
     <w:p>
       <w:pPr>
         <w:pStyle w:val="Heading2"/>
       </w:pPr>
       <w:r>
-        <w:t xml:space="preserve">3.5 Uncertainty: 400 versions of the model</w:t>
+        <w:t xml:space="preserve">3.6 Uncertainty: 400 versions of the model</w:t>
       </w:r>
     </w:p>
     <w:tbl>
@@ -3735,14 +4317,14 @@
         <w:t xml:space="preserve">Encroachment rises from 2% to a median 7% once buildings are allowed to block more than their footprint. This supports the view that the main run understates it.</w:t>
       </w:r>
     </w:p>
-    <w:bookmarkEnd w:id="24"/>
-    <w:bookmarkStart w:id="25" w:name="the-crossings-to-clear-first"/>
+    <w:bookmarkEnd w:id="27"/>
+    <w:bookmarkStart w:id="28" w:name="the-crossings-to-clear-first"/>
     <w:p>
       <w:pPr>
         <w:pStyle w:val="Heading2"/>
       </w:pPr>
       <w:r>
-        <w:t xml:space="preserve">3.6 The crossings to clear first</w:t>
+        <w:t xml:space="preserve">3.7 The crossings to clear first</w:t>
       </w:r>
     </w:p>
     <w:p>
@@ -4418,14 +5000,225 @@
         <w:t xml:space="preserve">.</w:t>
       </w:r>
     </w:p>
-    <w:bookmarkEnd w:id="25"/>
-    <w:bookmarkStart w:id="26" w:name="how-the-exposure-was-built"/>
+    <w:bookmarkEnd w:id="28"/>
+    <w:bookmarkStart w:id="29" w:name="what-it-costs"/>
     <w:p>
       <w:pPr>
         <w:pStyle w:val="Heading2"/>
       </w:pPr>
       <w:r>
-        <w:t xml:space="preserve">3.7 How the exposure was built</w:t>
+        <w:t xml:space="preserve">3.8 What it costs</w:t>
+      </w:r>
+    </w:p>
+    <w:tbl>
+      <w:tblPr>
+        <w:tblStyle w:val="Table"/>
+        <w:tblW w:type="pct" w:w="5000"/>
+        <w:tblLayout w:type="fixed"/>
+        <w:tblLook w:firstRow="1" w:lastRow="0" w:firstColumn="0" w:lastColumn="0" w:noHBand="0" w:noVBand="0" w:val="0020"/>
+      </w:tblPr>
+      <w:tblGrid>
+        <w:gridCol w:w="2640"/>
+        <w:gridCol w:w="2640"/>
+        <w:gridCol w:w="2640"/>
+      </w:tblGrid>
+      <w:tr>
+        <w:trPr>
+          <w:tblHeader w:val="on"/>
+        </w:trPr>
+        <w:tc>
+          <w:tcPr/>
+          <w:p>
+            <w:pPr>
+              <w:pStyle w:val="Compact"/>
+            </w:pPr>
+            <w:r>
+              <w:t xml:space="preserve">Avoided by keeping channels clean (US$ million a year)</w:t>
+            </w:r>
+          </w:p>
+        </w:tc>
+        <w:tc>
+          <w:tcPr/>
+          <w:p>
+            <w:pPr>
+              <w:pStyle w:val="Compact"/>
+            </w:pPr>
+            <w:r>
+              <w:t xml:space="preserve">Central</w:t>
+            </w:r>
+          </w:p>
+        </w:tc>
+        <w:tc>
+          <w:tcPr/>
+          <w:p>
+            <w:pPr>
+              <w:pStyle w:val="Compact"/>
+            </w:pPr>
+            <w:r>
+              <w:t xml:space="preserve">90% range</w:t>
+            </w:r>
+          </w:p>
+        </w:tc>
+      </w:tr>
+      <w:tr>
+        <w:tc>
+          <w:tcPr/>
+          <w:p>
+            <w:pPr>
+              <w:pStyle w:val="Compact"/>
+            </w:pPr>
+            <w:r>
+              <w:t xml:space="preserve">Travel disruption (lost access + delay)</w:t>
+            </w:r>
+          </w:p>
+        </w:tc>
+        <w:tc>
+          <w:tcPr/>
+          <w:p>
+            <w:pPr>
+              <w:pStyle w:val="Compact"/>
+            </w:pPr>
+            <w:r>
+              <w:t xml:space="preserve">0.5</w:t>
+            </w:r>
+          </w:p>
+        </w:tc>
+        <w:tc>
+          <w:tcPr/>
+          <w:p>
+            <w:pPr>
+              <w:pStyle w:val="Compact"/>
+            </w:pPr>
+            <w:r>
+              <w:t xml:space="preserve">0.2–1.0</w:t>
+            </w:r>
+          </w:p>
+        </w:tc>
+      </w:tr>
+      <w:tr>
+        <w:tc>
+          <w:tcPr/>
+          <w:p>
+            <w:pPr>
+              <w:pStyle w:val="Compact"/>
+            </w:pPr>
+            <w:r>
+              <w:t xml:space="preserve">Building damage (Paper 4)</w:t>
+            </w:r>
+          </w:p>
+        </w:tc>
+        <w:tc>
+          <w:tcPr/>
+          <w:p>
+            <w:pPr>
+              <w:pStyle w:val="Compact"/>
+            </w:pPr>
+            <w:r>
+              <w:t xml:space="preserve">17.3</w:t>
+            </w:r>
+          </w:p>
+        </w:tc>
+        <w:tc>
+          <w:tcPr/>
+          <w:p>
+            <w:pPr>
+              <w:pStyle w:val="Compact"/>
+            </w:pPr>
+            <w:r>
+              <w:t xml:space="preserve">8.6–34.5</w:t>
+            </w:r>
+          </w:p>
+        </w:tc>
+      </w:tr>
+      <w:tr>
+        <w:tc>
+          <w:tcPr/>
+          <w:p>
+            <w:pPr>
+              <w:pStyle w:val="Compact"/>
+            </w:pPr>
+            <w:r>
+              <w:rPr>
+                <w:b/>
+                <w:bCs/>
+              </w:rPr>
+              <w:t xml:space="preserve">Total</w:t>
+            </w:r>
+          </w:p>
+        </w:tc>
+        <w:tc>
+          <w:tcPr/>
+          <w:p>
+            <w:pPr>
+              <w:pStyle w:val="Compact"/>
+            </w:pPr>
+            <w:r>
+              <w:rPr>
+                <w:b/>
+                <w:bCs/>
+              </w:rPr>
+              <w:t xml:space="preserve">17.7</w:t>
+            </w:r>
+          </w:p>
+        </w:tc>
+        <w:tc>
+          <w:tcPr/>
+          <w:p>
+            <w:pPr>
+              <w:pStyle w:val="Compact"/>
+            </w:pPr>
+          </w:p>
+        </w:tc>
+      </w:tr>
+      <w:tr>
+        <w:tc>
+          <w:tcPr/>
+          <w:p>
+            <w:pPr>
+              <w:pStyle w:val="Compact"/>
+            </w:pPr>
+            <w:r>
+              <w:t xml:space="preserve">KCCA road-and-drainage maintenance allocation</w:t>
+            </w:r>
+          </w:p>
+        </w:tc>
+        <w:tc>
+          <w:tcPr/>
+          <w:p>
+            <w:pPr>
+              <w:pStyle w:val="Compact"/>
+            </w:pPr>
+            <w:r>
+              <w:t xml:space="preserve">2.7</w:t>
+            </w:r>
+          </w:p>
+        </w:tc>
+        <w:tc>
+          <w:tcPr/>
+          <w:p>
+            <w:pPr>
+              <w:pStyle w:val="Compact"/>
+            </w:pPr>
+          </w:p>
+        </w:tc>
+      </w:tr>
+    </w:tbl>
+    <w:p>
+      <w:pPr>
+        <w:pStyle w:val="BodyText"/>
+      </w:pPr>
+      <w:r>
+        <w:t xml:space="preserve">Travel losses are modest on their own because floods are short and the network offers detours. Building damage dominates. Together, the losses avoided by clean channels are about 6.6 times what KCCA is allocated for maintaining roads and drains. Even the low end of the range (about US$9 million) is more than three times that allocation. These are lower bounds: they exclude lost trade, goods, health effects, deaths and the cost of emergency response.</w:t>
+      </w:r>
+    </w:p>
+    <w:bookmarkEnd w:id="29"/>
+    <w:bookmarkStart w:id="30" w:name="how-the-exposure-was-built"/>
+    <w:p>
+      <w:pPr>
+        <w:pStyle w:val="Heading2"/>
+      </w:pPr>
+      <w:r>
+        <w:t xml:space="preserve">3.9 How the exposure was built</w:t>
       </w:r>
     </w:p>
     <w:p>
@@ -4436,9 +5229,9 @@
         <w:t xml:space="preserve">Kampala’s urban road network grew from 2,127 km (1975) to 5,262 km (2020). The share on low ground beside channels stayed near 6%, but its length more than doubled, from 141 to 315 km (Fig. kd47). 526 km of today’s road sits on valley floor that was wetland or bush in 1986. Of the road impassable in a 10-year storm with clean channels, 68% lies on such former wetland. At Lubigi, the Northern Bypass and its feeder roads were built across what was open wetland in 1986 (Fig. kd49).</w:t>
       </w:r>
     </w:p>
-    <w:bookmarkEnd w:id="26"/>
-    <w:bookmarkEnd w:id="27"/>
-    <w:bookmarkStart w:id="28" w:name="discussion"/>
+    <w:bookmarkEnd w:id="30"/>
+    <w:bookmarkEnd w:id="31"/>
+    <w:bookmarkStart w:id="32" w:name="discussion"/>
     <w:p>
       <w:pPr>
         <w:pStyle w:val="Heading1"/>
@@ -4504,13 +5297,13 @@
           <w:b/>
           <w:bCs/>
         </w:rPr>
-        <w:t xml:space="preserve">Climate adaptation depends on maintenance.</w:t>
-      </w:r>
-      <w:r>
-        <w:t xml:space="preserve"> </w:t>
-      </w:r>
-      <w:r>
-        <w:t xml:space="preserve">Climate change matters most for a well-maintained system. Investing in climate-resilient road drainage without a maintenance regime would see its benefits masked by silt.</w:t>
+        <w:t xml:space="preserve">The reports point to silt too.</w:t>
+      </w:r>
+      <w:r>
+        <w:t xml:space="preserve"> </w:t>
+      </w:r>
+      <w:r>
+        <w:t xml:space="preserve">The flood-prone roads people report fit the silted model clearly better than the clean one (AUC 0.80 vs 0.70). Satellites cannot measure silt in Kampala’s narrow channels, but the pattern of reported flooding is what silted channels would produce.</w:t>
       </w:r>
     </w:p>
     <w:p>
@@ -4526,13 +5319,13 @@
           <w:b/>
           <w:bCs/>
         </w:rPr>
-        <w:t xml:space="preserve">Targeting.</w:t>
-      </w:r>
-      <w:r>
-        <w:t xml:space="preserve"> </w:t>
-      </w:r>
-      <w:r>
-        <w:t xml:space="preserve">The crossing ranking gives KCCA and UNRA a short list where pre-season desilting buys the most network function. Each of the top five crossings carries the fastest route into town for 200,000 to 1.1 million residents (these route counts overlap and cannot be summed).</w:t>
+        <w:t xml:space="preserve">The economics are lopsided.</w:t>
+      </w:r>
+      <w:r>
+        <w:t xml:space="preserve"> </w:t>
+      </w:r>
+      <w:r>
+        <w:t xml:space="preserve">Losses avoided by clean channels are several times the maintenance allocation, so under-funding desilting is a false economy.</w:t>
       </w:r>
     </w:p>
     <w:p>
@@ -4548,13 +5341,13 @@
           <w:b/>
           <w:bCs/>
         </w:rPr>
-        <w:t xml:space="preserve">Planning.</w:t>
-      </w:r>
-      <w:r>
-        <w:t xml:space="preserve"> </w:t>
-      </w:r>
-      <w:r>
-        <w:t xml:space="preserve">Most flooded road was built on former wetland. New roads in Kampala’s fringe and in Uganda’s regional cities (Paper 7) should avoid valley floors or cross them on bridges sized for future flows.</w:t>
+        <w:t xml:space="preserve">Climate adaptation depends on maintenance.</w:t>
+      </w:r>
+      <w:r>
+        <w:t xml:space="preserve"> </w:t>
+      </w:r>
+      <w:r>
+        <w:t xml:space="preserve">Climate change matters most for a well-maintained system. Investing in climate-resilient road drainage without a maintenance regime would see its benefits masked by silt.</w:t>
       </w:r>
     </w:p>
     <w:p>
@@ -4570,6 +5363,50 @@
           <w:b/>
           <w:bCs/>
         </w:rPr>
+        <w:t xml:space="preserve">Targeting.</w:t>
+      </w:r>
+      <w:r>
+        <w:t xml:space="preserve"> </w:t>
+      </w:r>
+      <w:r>
+        <w:t xml:space="preserve">The crossing ranking gives KCCA and UNRA a short list where pre-season desilting buys the most network function. Each of the top five crossings carries the fastest route into town for 200,000 to 1.1 million residents (these route counts overlap and cannot be summed).</w:t>
+      </w:r>
+    </w:p>
+    <w:p>
+      <w:pPr>
+        <w:pStyle w:val="Compact"/>
+        <w:numPr>
+          <w:ilvl w:val="0"/>
+          <w:numId w:val="1006"/>
+        </w:numPr>
+      </w:pPr>
+      <w:r>
+        <w:rPr>
+          <w:b/>
+          <w:bCs/>
+        </w:rPr>
+        <w:t xml:space="preserve">Planning.</w:t>
+      </w:r>
+      <w:r>
+        <w:t xml:space="preserve"> </w:t>
+      </w:r>
+      <w:r>
+        <w:t xml:space="preserve">Most flooded road was built on former wetland. New roads in Kampala’s fringe and in Uganda’s regional cities (Paper 7) should avoid valley floors or cross them on bridges sized for future flows.</w:t>
+      </w:r>
+    </w:p>
+    <w:p>
+      <w:pPr>
+        <w:pStyle w:val="Compact"/>
+        <w:numPr>
+          <w:ilvl w:val="0"/>
+          <w:numId w:val="1006"/>
+        </w:numPr>
+      </w:pPr>
+      <w:r>
+        <w:rPr>
+          <w:b/>
+          <w:bCs/>
+        </w:rPr>
         <w:t xml:space="preserve">Limitations:</w:t>
       </w:r>
     </w:p>
@@ -4699,7 +5536,7 @@
         <w:t xml:space="preserve"> </w:t>
       </w:r>
       <w:r>
-        <w:t xml:space="preserve">relies on eight reported events: enough to confirm that the model places floods in the right spots, not to calibrate depths.</w:t>
+        <w:t xml:space="preserve">uses 8 catalogue events and 12 geocoded flood-prone road locations: enough to show that the model places floods in the right areas, not to calibrate depths.</w:t>
       </w:r>
     </w:p>
     <w:p>
@@ -4715,6 +5552,50 @@
           <w:b/>
           <w:bCs/>
         </w:rPr>
+        <w:t xml:space="preserve">Street flooding is not modelled.</w:t>
+      </w:r>
+      <w:r>
+        <w:t xml:space="preserve"> </w:t>
+      </w:r>
+      <w:r>
+        <w:t xml:space="preserve">Ponding at junctions from blocked roadside drains (for example Kyambogo Junction, Banda) is outside the model, which floods roads only from channel overflow.</w:t>
+      </w:r>
+    </w:p>
+    <w:p>
+      <w:pPr>
+        <w:pStyle w:val="Compact"/>
+        <w:numPr>
+          <w:ilvl w:val="1"/>
+          <w:numId w:val="1007"/>
+        </w:numPr>
+      </w:pPr>
+      <w:r>
+        <w:rPr>
+          <w:b/>
+          <w:bCs/>
+        </w:rPr>
+        <w:t xml:space="preserve">Costs</w:t>
+      </w:r>
+      <w:r>
+        <w:t xml:space="preserve"> </w:t>
+      </w:r>
+      <w:r>
+        <w:t xml:space="preserve">use assumed values of time, flood durations and trip shares, given as ranges.</w:t>
+      </w:r>
+    </w:p>
+    <w:p>
+      <w:pPr>
+        <w:pStyle w:val="Compact"/>
+        <w:numPr>
+          <w:ilvl w:val="1"/>
+          <w:numId w:val="1007"/>
+        </w:numPr>
+      </w:pPr>
+      <w:r>
+        <w:rPr>
+          <w:b/>
+          <w:bCs/>
+        </w:rPr>
         <w:t xml:space="preserve">Culvert dimensions are not observed.</w:t>
       </w:r>
       <w:r>
@@ -4724,8 +5605,8 @@
         <w:t xml:space="preserve">Street-level imagery could fill this gap with computer vision: measuring culvert openings and detecting blockage at the ranked crossings. Open street-level archives are thin in Kampala, though: KartaView has a photo within 60 m of only 2 of the top 60 crossings, and Mapillary was not accessible for this study. A culvert inventory from KCCA or UNRA would be the most direct way to close this gap.</w:t>
       </w:r>
     </w:p>
-    <w:bookmarkEnd w:id="28"/>
-    <w:bookmarkStart w:id="29" w:name="conclusion"/>
+    <w:bookmarkEnd w:id="32"/>
+    <w:bookmarkStart w:id="33" w:name="conclusion"/>
     <w:p>
       <w:pPr>
         <w:pStyle w:val="Heading1"/>
@@ -4742,8 +5623,8 @@
         <w:t xml:space="preserve">Most of the growth in Kampala’s road flooding since 1990 comes from silted channels, not storms. Siltation explains more than four-fifths of the increase in impassable road and in people cut off. Paving explains most of the rest, and climate change adds less than a tenth by the 2050s. Keeping a short list of channel crossings clear would restore much of the network’s function in ordinary storms. The method uses only open data and can be applied to any city with a road map and a terrain model.</w:t>
       </w:r>
     </w:p>
-    <w:bookmarkEnd w:id="29"/>
-    <w:bookmarkStart w:id="30" w:name="data-and-code-availability"/>
+    <w:bookmarkEnd w:id="33"/>
+    <w:bookmarkStart w:id="34" w:name="data-and-code-availability"/>
     <w:p>
       <w:pPr>
         <w:pStyle w:val="Heading1"/>
@@ -4811,6 +5692,36 @@
         <w:rPr>
           <w:rStyle w:val="VerbatimChar"/>
         </w:rPr>
+        <w:t xml:space="preserve">src/kd_roads_upgrade.py</w:t>
+      </w:r>
+      <w:r>
+        <w:t xml:space="preserve"> </w:t>
+      </w:r>
+      <w:r>
+        <w:t xml:space="preserve">(spatial silt, validation, costs),</w:t>
+      </w:r>
+      <w:r>
+        <w:t xml:space="preserve"> </w:t>
+      </w:r>
+      <w:r>
+        <w:rPr>
+          <w:rStyle w:val="VerbatimChar"/>
+        </w:rPr>
+        <w:t xml:space="preserve">src/kd_channel_condition.py</w:t>
+      </w:r>
+      <w:r>
+        <w:t xml:space="preserve"> </w:t>
+      </w:r>
+      <w:r>
+        <w:t xml:space="preserve">(Sentinel-2 channel test),</w:t>
+      </w:r>
+      <w:r>
+        <w:t xml:space="preserve"> </w:t>
+      </w:r>
+      <w:r>
+        <w:rPr>
+          <w:rStyle w:val="VerbatimChar"/>
+        </w:rPr>
         <w:t xml:space="preserve">src/kd_roads_maps.py</w:t>
       </w:r>
       <w:r>
@@ -4859,8 +5770,8 @@
         <w:t xml:space="preserve">.</w:t>
       </w:r>
     </w:p>
-    <w:bookmarkEnd w:id="30"/>
-    <w:bookmarkStart w:id="31" w:name="figures"/>
+    <w:bookmarkEnd w:id="34"/>
+    <w:bookmarkStart w:id="35" w:name="figures"/>
     <w:p>
       <w:pPr>
         <w:pStyle w:val="Heading1"/>
@@ -4977,8 +5888,20 @@
         <w:t xml:space="preserve">kd53: Monte Carlo uncertainty (400 draws) and the emulator’s ranking of assumptions.</w:t>
       </w:r>
     </w:p>
-    <w:bookmarkEnd w:id="31"/>
-    <w:bookmarkStart w:id="32" w:name="references"/>
+    <w:p>
+      <w:pPr>
+        <w:pStyle w:val="Compact"/>
+        <w:numPr>
+          <w:ilvl w:val="0"/>
+          <w:numId w:val="1008"/>
+        </w:numPr>
+      </w:pPr>
+      <w:r>
+        <w:t xml:space="preserve">kd54: validation against flood-prone roads from KCCA, the press and the flood catalogue.</w:t>
+      </w:r>
+    </w:p>
+    <w:bookmarkEnd w:id="35"/>
+    <w:bookmarkStart w:id="36" w:name="references"/>
     <w:p>
       <w:pPr>
         <w:pStyle w:val="Heading1"/>
@@ -5373,7 +6296,7 @@
         </w:numPr>
       </w:pPr>
       <w:r>
-        <w:t xml:space="preserve">† TRID record 2724562 (2025/26). Flood-induced traffic disruption and network vulnerability in Kampala’s urban road system. Transportation Research Board (authors and journal to confirm).</w:t>
+        <w:t xml:space="preserve">† Flood-induced traffic disruption and network vulnerability in Kampala’s urban road system (2026). ScienceDirect, article S2950196226000311; TRID record 2724562 (authors and journal to confirm).</w:t>
       </w:r>
     </w:p>
     <w:p>
@@ -5453,23 +6376,7 @@
         </w:numPr>
       </w:pPr>
       <w:r>
-        <w:t xml:space="preserve">Breiman, L. (2001). Random forests.</w:t>
-      </w:r>
-      <w:r>
-        <w:t xml:space="preserve"> </w:t>
-      </w:r>
-      <w:r>
-        <w:rPr>
-          <w:i/>
-          <w:iCs/>
-        </w:rPr>
-        <w:t xml:space="preserve">Machine Learning</w:t>
-      </w:r>
-      <w:r>
-        <w:t xml:space="preserve"> </w:t>
-      </w:r>
-      <w:r>
-        <w:t xml:space="preserve">45, 5–32.</w:t>
+        <w:t xml:space="preserve">† Daily Monitor (2023). Let’s watch out for flood prone roads (editorial listing KCCA’s 2021 flood-risk roads).</w:t>
       </w:r>
     </w:p>
     <w:p>
@@ -5481,23 +6388,7 @@
         </w:numPr>
       </w:pPr>
       <w:r>
-        <w:t xml:space="preserve">Friedman, J. H. (2001). Greedy function approximation: a gradient boosting machine.</w:t>
-      </w:r>
-      <w:r>
-        <w:t xml:space="preserve"> </w:t>
-      </w:r>
-      <w:r>
-        <w:rPr>
-          <w:i/>
-          <w:iCs/>
-        </w:rPr>
-        <w:t xml:space="preserve">Annals of Statistics</w:t>
-      </w:r>
-      <w:r>
-        <w:t xml:space="preserve"> </w:t>
-      </w:r>
-      <w:r>
-        <w:t xml:space="preserve">29(5), 1189–1232.</w:t>
+        <w:t xml:space="preserve">† The Observer. Six killed, hundreds stranded as floods ravage Kampala (list of roads often cut off).</w:t>
       </w:r>
     </w:p>
     <w:p>
@@ -5509,23 +6400,7 @@
         </w:numPr>
       </w:pPr>
       <w:r>
-        <w:t xml:space="preserve">McKay, M. D., Beckman, R. J. and Conover, W. J. (1979). A comparison of three methods for selecting values of input variables in the analysis of output from a computer code.</w:t>
-      </w:r>
-      <w:r>
-        <w:t xml:space="preserve"> </w:t>
-      </w:r>
-      <w:r>
-        <w:rPr>
-          <w:i/>
-          <w:iCs/>
-        </w:rPr>
-        <w:t xml:space="preserve">Technometrics</w:t>
-      </w:r>
-      <w:r>
-        <w:t xml:space="preserve"> </w:t>
-      </w:r>
-      <w:r>
-        <w:t xml:space="preserve">21(2), 239–245.</w:t>
+        <w:t xml:space="preserve">† KCCA. MPs: KCCA can’t maintain roads, drainage on UGX 10 billion. kcca.go.ug/news/1102.</w:t>
       </w:r>
     </w:p>
     <w:p>
@@ -5537,23 +6412,7 @@
         </w:numPr>
       </w:pPr>
       <w:r>
-        <w:t xml:space="preserve">Pedregosa, F. et al. (2011). Scikit-learn: machine learning in Python.</w:t>
-      </w:r>
-      <w:r>
-        <w:t xml:space="preserve"> </w:t>
-      </w:r>
-      <w:r>
-        <w:rPr>
-          <w:i/>
-          <w:iCs/>
-        </w:rPr>
-        <w:t xml:space="preserve">Journal of Machine Learning Research</w:t>
-      </w:r>
-      <w:r>
-        <w:t xml:space="preserve"> </w:t>
-      </w:r>
-      <w:r>
-        <w:t xml:space="preserve">12, 2825–2830.</w:t>
+        <w:t xml:space="preserve">† Daily Monitor. Under the 30 km/h speed limit, Kampala’s slower streets could spell a slower economy (commentary; productivity value of time).</w:t>
       </w:r>
     </w:p>
     <w:p>
@@ -5565,10 +6424,150 @@
         </w:numPr>
       </w:pPr>
       <w:r>
+        <w:t xml:space="preserve">Mann, H. B. and Whitney, D. R. (1947). On a test of whether one of two random variables is stochastically larger than the other.</w:t>
+      </w:r>
+      <w:r>
+        <w:t xml:space="preserve"> </w:t>
+      </w:r>
+      <w:r>
+        <w:rPr>
+          <w:i/>
+          <w:iCs/>
+        </w:rPr>
+        <w:t xml:space="preserve">Annals of Mathematical Statistics</w:t>
+      </w:r>
+      <w:r>
+        <w:t xml:space="preserve"> </w:t>
+      </w:r>
+      <w:r>
+        <w:t xml:space="preserve">18, 50–60.</w:t>
+      </w:r>
+    </w:p>
+    <w:p>
+      <w:pPr>
+        <w:pStyle w:val="Compact"/>
+        <w:numPr>
+          <w:ilvl w:val="0"/>
+          <w:numId w:val="1009"/>
+        </w:numPr>
+      </w:pPr>
+      <w:r>
+        <w:t xml:space="preserve">Breiman, L. (2001). Random forests.</w:t>
+      </w:r>
+      <w:r>
+        <w:t xml:space="preserve"> </w:t>
+      </w:r>
+      <w:r>
+        <w:rPr>
+          <w:i/>
+          <w:iCs/>
+        </w:rPr>
+        <w:t xml:space="preserve">Machine Learning</w:t>
+      </w:r>
+      <w:r>
+        <w:t xml:space="preserve"> </w:t>
+      </w:r>
+      <w:r>
+        <w:t xml:space="preserve">45, 5–32.</w:t>
+      </w:r>
+    </w:p>
+    <w:p>
+      <w:pPr>
+        <w:pStyle w:val="Compact"/>
+        <w:numPr>
+          <w:ilvl w:val="0"/>
+          <w:numId w:val="1009"/>
+        </w:numPr>
+      </w:pPr>
+      <w:r>
+        <w:t xml:space="preserve">Friedman, J. H. (2001). Greedy function approximation: a gradient boosting machine.</w:t>
+      </w:r>
+      <w:r>
+        <w:t xml:space="preserve"> </w:t>
+      </w:r>
+      <w:r>
+        <w:rPr>
+          <w:i/>
+          <w:iCs/>
+        </w:rPr>
+        <w:t xml:space="preserve">Annals of Statistics</w:t>
+      </w:r>
+      <w:r>
+        <w:t xml:space="preserve"> </w:t>
+      </w:r>
+      <w:r>
+        <w:t xml:space="preserve">29(5), 1189–1232.</w:t>
+      </w:r>
+    </w:p>
+    <w:p>
+      <w:pPr>
+        <w:pStyle w:val="Compact"/>
+        <w:numPr>
+          <w:ilvl w:val="0"/>
+          <w:numId w:val="1009"/>
+        </w:numPr>
+      </w:pPr>
+      <w:r>
+        <w:t xml:space="preserve">McKay, M. D., Beckman, R. J. and Conover, W. J. (1979). A comparison of three methods for selecting values of input variables in the analysis of output from a computer code.</w:t>
+      </w:r>
+      <w:r>
+        <w:t xml:space="preserve"> </w:t>
+      </w:r>
+      <w:r>
+        <w:rPr>
+          <w:i/>
+          <w:iCs/>
+        </w:rPr>
+        <w:t xml:space="preserve">Technometrics</w:t>
+      </w:r>
+      <w:r>
+        <w:t xml:space="preserve"> </w:t>
+      </w:r>
+      <w:r>
+        <w:t xml:space="preserve">21(2), 239–245.</w:t>
+      </w:r>
+    </w:p>
+    <w:p>
+      <w:pPr>
+        <w:pStyle w:val="Compact"/>
+        <w:numPr>
+          <w:ilvl w:val="0"/>
+          <w:numId w:val="1009"/>
+        </w:numPr>
+      </w:pPr>
+      <w:r>
+        <w:t xml:space="preserve">Pedregosa, F. et al. (2011). Scikit-learn: machine learning in Python.</w:t>
+      </w:r>
+      <w:r>
+        <w:t xml:space="preserve"> </w:t>
+      </w:r>
+      <w:r>
+        <w:rPr>
+          <w:i/>
+          <w:iCs/>
+        </w:rPr>
+        <w:t xml:space="preserve">Journal of Machine Learning Research</w:t>
+      </w:r>
+      <w:r>
+        <w:t xml:space="preserve"> </w:t>
+      </w:r>
+      <w:r>
+        <w:t xml:space="preserve">12, 2825–2830.</w:t>
+      </w:r>
+    </w:p>
+    <w:p>
+      <w:pPr>
+        <w:pStyle w:val="Compact"/>
+        <w:numPr>
+          <w:ilvl w:val="0"/>
+          <w:numId w:val="1009"/>
+        </w:numPr>
+      </w:pPr>
+      <w:r>
         <w:t xml:space="preserve">Companion papers of this programme: A, D0 (flood catalogue), 1 (lost sponge, incl. machine-learning land cover), 3 (access), 4 (damage), 6 (channel design drift), 7 (regional cities).</w:t>
       </w:r>
     </w:p>
-    <w:bookmarkEnd w:id="32"/>
+    <w:bookmarkEnd w:id="36"/>
     <w:sectPr>
       <w:footnotePr>
         <w:numRestart w:val="eachSect"/>

</xml_diff>